<commit_message>
Completa el Entregable 2: Parte A a ago-2026, dataset v2, dashboard y presentación
- Parte A recalculada al corte ago-2026 (tabla 2.3, matriz 3.1, fundamentos
  y 12 gráficos) con EDA/eda_ago26.py.
- Parte B completa: 1.3 antes/después, 2.1 dataset de entrenamiento v2
  (131.189 filas x 67 features, sin leakage, tabla de variables excluidas)
  y 2.2 transformaciones.
- Dataset en Datasets_Modelo/ generado por Modelo/construir_dataset_modelo.py.
- Dashboard de 5 pestañas con insights (Dashboard-Calidad-Antes-Despues.html).
- Presentación en un solo archivo, dos versiones para elegir: v1 completa
  (34 diapositivas) y v2 corta (14), en HTML y PDF.
- README en la raíz y en Presentacion/; todos los .md de Recordatorios al día;
  respuestas de la ronda 2 y diapositivas de la Unidad 2 en Material/.

Co-Authored-By: Claude Opus 5.5 <noreply@anthropic.com>
</commit_message>
<xml_diff>
--- a/Entregable/Entregable 2/Entregable 2 - Parte A - COMPLETADO.docx
+++ b/Entregable/Entregable 2/Entregable 2 - Parte A - COMPLETADO.docx
@@ -887,7 +887,7 @@
           <w:sz w:val="21"/>
           <w:szCs w:val="21"/>
         </w:rPr>
-        <w:t xml:space="preserve">El análisis se realizó sobre las 15 fuentes de datos disponibles, con corte en diciembre de 2025, que es el último mes cubierto por las fuentes transaccionales principales (Ventas, Stock, Liquidaciones y Devoluciones). Los datos se analizaron sin modificar los archivos de origen.</w:t>
+        <w:t>El análisis se realizó sobre las 15 fuentes de datos disponibles, con corte en agosto de 2026, que es el último mes cubierto por las fuentes transaccionales principales (Ventas, Stock y Liquidaciones). Los datos de 2026 llegaron en una segunda entrega: son los mismos archivos con los meses nuevos agregados, y se verificó que el tramo 2022-2025 quedó idéntico. Los archivos de origen no se modificaron.</w:t>
       </w:r>
     </w:p>
     <w:p>
@@ -1046,7 +1046,7 @@
           <w:sz w:val="21"/>
           <w:szCs w:val="21"/>
         </w:rPr>
-        <w:t xml:space="preserve">El análisis se ejecutó sobre las 15 fuentes en su estado original. Para las métricas de negocio se aplicó el criterio de consolidación definido en el Entregable 1: deduplicación por clave conservando la primera ocurrencia, corrección de valores negativos y normalización de las variantes de categoría.</w:t>
+        <w:t>El diagnóstico de calidad se ejecutó sobre las 15 fuentes en su estado original. Para las métricas de negocio se aplicaron los criterios acordados con Casa Óga en la segunda ronda de consultas: deduplicación por clave conservando la primera ocurrencia, stock negativo llevado a cero, devoluciones neteadas contra la venta del mismo SKU, tienda y mes, y unificación de las variantes de categoría.</w:t>
       </w:r>
     </w:p>
     <w:p>
@@ -1940,7 +1940,7 @@
                 <w:sz w:val="16"/>
                 <w:szCs w:val="16"/>
               </w:rPr>
-              <w:t xml:space="preserve">15 fuentes relevadas. Las dos mayores (Ventas y Stock) tienen 239.336 filas cada una; el resto va de 7 a 23.858 registros.</w:t>
+              <w:t>15 fuentes relevadas. Las dos mayores (Ventas y Stock) tienen 299.400 filas cada una; el resto va de 7 a 23.858 registros.</w:t>
             </w:r>
           </w:p>
         </w:tc>
@@ -2052,7 +2052,7 @@
                 <w:sz w:val="16"/>
                 <w:szCs w:val="16"/>
               </w:rPr>
-              <w:t xml:space="preserve">Fuentes transaccionales principales: ene-2022 a dic-2025 (48 meses). Seis fuentes se extienden hasta 2026 (Presupuesto y Promociones a ago-26, Transferencias a sep-26).</w:t>
+              <w:t>Ventas, Stock, Liquidaciones, Presupuesto, Promociones y Stock de depósito: ene-2022 a ago-2026 (56 meses). Devoluciones y Calendario terminan en dic-2025; el catálogo no registra altas desde jun-2025.</w:t>
             </w:r>
           </w:p>
         </w:tc>
@@ -2079,7 +2079,7 @@
                 <w:sz w:val="16"/>
                 <w:szCs w:val="16"/>
               </w:rPr>
-              <w:t xml:space="preserve">El corte de análisis queda fijado en dic-2025, que es hasta donde llegan Ventas y Stock. Los registros de 2026 quedan fuera del período comparable.</w:t>
+              <w:t>El corte de análisis es agosto de 2026. Tres fuentes no acompañan la extensión del período (Devoluciones, Calendario y catálogo), lo que limita cualquier análisis de 2026 que dependa de ellas.</w:t>
             </w:r>
           </w:p>
         </w:tc>
@@ -2106,7 +2106,7 @@
                 <w:sz w:val="16"/>
                 <w:szCs w:val="16"/>
               </w:rPr>
-              <w:t xml:space="preserve">—</w:t>
+              <w:t>—</w:t>
             </w:r>
           </w:p>
         </w:tc>
@@ -2473,7 +2473,7 @@
                 <w:sz w:val="16"/>
                 <w:szCs w:val="16"/>
               </w:rPr>
-              <w:t xml:space="preserve">Unidades vendidas por posición (2025)</w:t>
+              <w:t>Unidades vendidas por posición (últimos 12 meses)</w:t>
             </w:r>
           </w:p>
         </w:tc>
@@ -2500,7 +2500,7 @@
                 <w:sz w:val="16"/>
                 <w:szCs w:val="16"/>
               </w:rPr>
-              <w:t xml:space="preserve">Media 3,21 · mediana 2 · p75 4 · p95 11 · p99 17 · máximo 31.</w:t>
+              <w:t>Últimos 12 meses (sep-25 a ago-26): media 3,09 · mediana 2 · p75 4 · p95 11 · p99 17 · máximo 33.</w:t>
             </w:r>
           </w:p>
         </w:tc>
@@ -2527,7 +2527,7 @@
                 <w:sz w:val="16"/>
                 <w:szCs w:val="16"/>
               </w:rPr>
-              <w:t xml:space="preserve">Distribución fuertemente asimétrica con cola larga. Los 20.785 outliers por criterio IQR responden a esa asimetría, no a errores de carga.</w:t>
+              <w:t>Distribución fuertemente asimétrica con cola larga. Los valores altos responden a esa asimetría, no a errores de carga.</w:t>
             </w:r>
           </w:p>
         </w:tc>
@@ -2554,7 +2554,7 @@
                 <w:sz w:val="16"/>
                 <w:szCs w:val="16"/>
               </w:rPr>
-              <w:t xml:space="preserve">G12</w:t>
+              <w:t>G12</w:t>
             </w:r>
           </w:p>
         </w:tc>
@@ -2584,7 +2584,7 @@
                 <w:sz w:val="16"/>
                 <w:szCs w:val="16"/>
               </w:rPr>
-              <w:t xml:space="preserve">Venta neta por posición (2025)</w:t>
+              <w:t>Venta neta por posición (últimos 12 meses)</w:t>
             </w:r>
           </w:p>
         </w:tc>
@@ -2612,7 +2612,7 @@
                 <w:sz w:val="16"/>
                 <w:szCs w:val="16"/>
               </w:rPr>
-              <w:t xml:space="preserve">Media $140.114 · mediana $65.048 · p95 $551.997 · máximo $1,94 M.</w:t>
+              <w:t>Últimos 12 meses: media $134.386 · mediana $62.363 · p95 $531.408 · máximo $2,37 M.</w:t>
             </w:r>
           </w:p>
         </w:tc>
@@ -2668,7 +2668,7 @@
                 <w:sz w:val="16"/>
                 <w:szCs w:val="16"/>
               </w:rPr>
-              <w:t xml:space="preserve">G12</w:t>
+              <w:t>G12</w:t>
             </w:r>
           </w:p>
         </w:tc>
@@ -2697,7 +2697,7 @@
                 <w:sz w:val="16"/>
                 <w:szCs w:val="16"/>
               </w:rPr>
-              <w:t xml:space="preserve">Stock disponible por posición (dic-2025)</w:t>
+              <w:t>Stock disponible por posición (ago-2026)</w:t>
             </w:r>
           </w:p>
         </w:tc>
@@ -2724,7 +2724,7 @@
                 <w:sz w:val="16"/>
                 <w:szCs w:val="16"/>
               </w:rPr>
-              <w:t xml:space="preserve">Media 16,8 · mediana 10 · p95 54 · máximo 134 unidades. 7.993 posiciones con stock mayor a cero.</w:t>
+              <w:t>Agosto de 2026: media 15,9 · mediana 10 · p95 53 · máximo 145 unidades. 7.479 posiciones con stock mayor a cero.</w:t>
             </w:r>
           </w:p>
         </w:tc>
@@ -2751,7 +2751,7 @@
                 <w:sz w:val="16"/>
                 <w:szCs w:val="16"/>
               </w:rPr>
-              <w:t xml:space="preserve">El stock también es asimétrico. 647 SKUs tienen stock, de los cuales 13 ya figuran como discontinuados en el catálogo.</w:t>
+              <w:t>El stock también es asimétrico. 634 SKUs tienen stock y ninguno figura como discontinuado: el catálogo no registra bajas ni altas desde junio de 2025.</w:t>
             </w:r>
           </w:p>
         </w:tc>
@@ -2778,7 +2778,7 @@
                 <w:sz w:val="16"/>
                 <w:szCs w:val="16"/>
               </w:rPr>
-              <w:t xml:space="preserve">G12</w:t>
+              <w:t>G12</w:t>
             </w:r>
           </w:p>
         </w:tc>
@@ -2836,7 +2836,7 @@
                 <w:sz w:val="16"/>
                 <w:szCs w:val="16"/>
               </w:rPr>
-              <w:t xml:space="preserve">18,96% de las filas de venta registran 0 unidades vendidas.</w:t>
+              <w:t>El 18,01% de las filas de venta registra 0 unidades vendidas (ene-2022 a ago-2026).</w:t>
             </w:r>
           </w:p>
         </w:tc>
@@ -2864,7 +2864,7 @@
                 <w:sz w:val="16"/>
                 <w:szCs w:val="16"/>
               </w:rPr>
-              <w:t xml:space="preserve">Un cero no siempre significa ausencia de demanda: 1.790 filas tienen venta mayor a cero con stock en cero el mismo mes, lo que indica que también hay quiebres de stock.</w:t>
+              <w:t>Un cero no siempre significa ausencia de demanda: 1.020 filas tienen venta mayor a cero con stock en cero el mismo mes (187 de ellas en 2026), lo que indica quiebres de stock o desfase de registro.</w:t>
             </w:r>
           </w:p>
         </w:tc>
@@ -2892,7 +2892,7 @@
                 <w:sz w:val="16"/>
                 <w:szCs w:val="16"/>
               </w:rPr>
-              <w:t xml:space="preserve">—</w:t>
+              <w:t>—</w:t>
             </w:r>
           </w:p>
         </w:tc>
@@ -3064,7 +3064,7 @@
                 <w:sz w:val="16"/>
                 <w:szCs w:val="16"/>
               </w:rPr>
-              <w:t xml:space="preserve">$32.538,4 M y 750.538 unidades en 2022-2025. Por año: $1.812 M · $6.323 M (+249%) · $10.669 M (+69%) · $13.734 M (+29%).</w:t>
+              <w:t>$40.083,4 M y 925.015 unidades entre ene-2022 y ago-2026, con devoluciones neteadas. Por año: 2022 $1.789 M · 2023 $6.243 M · 2024 $10.530 M · 2025 $13.560 M · 2026 (8 meses) $7.961 M.</w:t>
             </w:r>
           </w:p>
         </w:tc>
@@ -3092,7 +3092,7 @@
                 <w:sz w:val="16"/>
                 <w:szCs w:val="16"/>
               </w:rPr>
-              <w:t xml:space="preserve">El crecimiento es sostenido pero desacelera año a año. Precio medio por unidad del período: $43.353.</w:t>
+              <w:t>El crecimiento es sostenido hasta 2025 pero desacelera año a año. Precio medio por unidad del período: $43.333.</w:t>
             </w:r>
           </w:p>
         </w:tc>
@@ -3120,7 +3120,7 @@
                 <w:sz w:val="16"/>
                 <w:szCs w:val="16"/>
               </w:rPr>
-              <w:t xml:space="preserve">G1</w:t>
+              <w:t>G1</w:t>
             </w:r>
           </w:p>
         </w:tc>
@@ -3176,7 +3176,7 @@
                 <w:sz w:val="16"/>
                 <w:szCs w:val="16"/>
               </w:rPr>
-              <w:t xml:space="preserve">Las posiciones con venta pasaron de 17 (ene-22) a 8.073 (dic-25). Las unidades vendidas por posición se mantienen planas en ~3,2 durante todo el período.</w:t>
+              <w:t>Las posiciones con registro de venta pasaron de 17 (ene-22) a 8.073 (dic-25) y 7.504 (ago-26). Las unidades vendidas por posición se mantienen planas en ~3,2 durante todo el período.</w:t>
             </w:r>
           </w:p>
         </w:tc>
@@ -3203,7 +3203,7 @@
                 <w:sz w:val="16"/>
                 <w:szCs w:val="16"/>
               </w:rPr>
-              <w:t xml:space="preserve">El crecimiento se explica por la expansión del catálogo y de la red de tiendas, no por mayor rotación de cada producto. Las posiciones con venta (8.073) no coinciden con las posiciones con stock (7.993) porque son universos distintos: una posición puede vender y quedar sin stock, o tener stock sin haber vendido ese mes.</w:t>
+              <w:t>El crecimiento se explica por la expansión del catálogo y de la red de tiendas, no por mayor rotación de cada producto. Las posiciones con venta no coinciden con las posiciones con stock (7.479 en ago-26) porque son conjuntos distintos: hay posiciones que venden todo su stock y otras con stock sin venta.</w:t>
             </w:r>
           </w:p>
         </w:tc>
@@ -3230,7 +3230,7 @@
                 <w:sz w:val="16"/>
                 <w:szCs w:val="16"/>
               </w:rPr>
-              <w:t xml:space="preserve">G2</w:t>
+              <w:t>G1</w:t>
             </w:r>
           </w:p>
         </w:tc>
@@ -3288,7 +3288,7 @@
                 <w:sz w:val="16"/>
                 <w:szCs w:val="16"/>
               </w:rPr>
-              <w:t xml:space="preserve">Ajustando la serie por su tendencia, el índice mensual se ubica entre 101 y 105 en todos los meses. En 2025 varía entre 96 y 104.</w:t>
+              <w:t>Ajustando la serie por su tendencia (media móvil de 12 meses), el índice mensual se ubica entre 98 y 106. Con el cálculo del TP1 (100 = promedio de cada año) va de 81 a 117.</w:t>
             </w:r>
           </w:p>
         </w:tc>
@@ -3316,7 +3316,7 @@
                 <w:sz w:val="16"/>
                 <w:szCs w:val="16"/>
               </w:rPr>
-              <w:t xml:space="preserve">No se detecta estacionalidad mensual relevante, ni efecto diferenciado de Hot Sale, Black Friday o Navidad a nivel agregado. Los picos aparentes corresponden a la tendencia de crecimiento.</w:t>
+              <w:t>No se detecta estacionalidad mensual relevante, ni efecto diferenciado de Hot Sale, Black Friday o Navidad a nivel agregado. Los picos aparentes corresponden a la tendencia de crecimiento.</w:t>
             </w:r>
           </w:p>
         </w:tc>
@@ -3344,7 +3344,7 @@
                 <w:sz w:val="16"/>
                 <w:szCs w:val="16"/>
               </w:rPr>
-              <w:t xml:space="preserve">G4</w:t>
+              <w:t>G4</w:t>
             </w:r>
           </w:p>
         </w:tc>
@@ -3373,7 +3373,7 @@
                 <w:sz w:val="16"/>
                 <w:szCs w:val="16"/>
               </w:rPr>
-              <w:t xml:space="preserve">Desaceleración 2025</w:t>
+              <w:t>Caída de 2026</w:t>
             </w:r>
           </w:p>
         </w:tc>
@@ -3400,7 +3400,7 @@
                 <w:sz w:val="16"/>
                 <w:szCs w:val="16"/>
               </w:rPr>
-              <w:t xml:space="preserve">El crecimiento interanual cae de +47% (ene-25) a +6,6% (dic-25). Las unidades mensuales se mantienen planas (25.096 en enero, 25.781 en diciembre).</w:t>
+              <w:t>Ene-ago 2026 contra ene-ago 2025: venta −13,2%, unidades −12,7%, posiciones con venta −8,1%. Quiebre de dic-25 a ene-26 (−564 posiciones) y recuperación mes a mes. Comparación en bruto: 2026 no trae devoluciones registradas.</w:t>
             </w:r>
           </w:p>
         </w:tc>
@@ -3427,7 +3427,7 @@
                 <w:sz w:val="16"/>
                 <w:szCs w:val="16"/>
               </w:rPr>
-              <w:t xml:space="preserve">2025 es el primer año sin expansión significativa, lo que lo vuelve el período más representativo para dimensionar la operación actual.</w:t>
+              <w:t>Es el primer año de caída después de tres de crecimiento. Si la venta cae y el stock no acompaña, la cobertura sube: explica que la cola de cobertura se engorde en 2026 (el percentil 99 por posición pasa de 16 a 48 meses).</w:t>
             </w:r>
           </w:p>
         </w:tc>
@@ -3454,7 +3454,7 @@
                 <w:sz w:val="16"/>
                 <w:szCs w:val="16"/>
               </w:rPr>
-              <w:t xml:space="preserve">G1</w:t>
+              <w:t>G1</w:t>
             </w:r>
           </w:p>
         </w:tc>
@@ -3624,7 +3624,7 @@
                 <w:sz w:val="16"/>
                 <w:szCs w:val="16"/>
               </w:rPr>
-              <w:t xml:space="preserve">Decoración 22,8% · Cocina y mesa 19,1% · Iluminación 14,2% · Textil hogar 12,7% · Muebles 11,8% · Organización 11,1% · Baño 8,4%.</w:t>
+              <w:t>Decoración 22,4% · Cocina y mesa 19,4% · Iluminación 13,6% · Textil hogar 12,9% · Muebles 11,9% · Organización 11,5% · Baño 8,3%.</w:t>
             </w:r>
           </w:p>
         </w:tc>
@@ -3651,7 +3651,7 @@
                 <w:sz w:val="16"/>
                 <w:szCs w:val="16"/>
               </w:rPr>
-              <w:t xml:space="preserve">El margen teórico de lista es parejo entre categorías (43,8% a 46,0%; promedio 44,9%), por lo que el mix no se explica por diferencias de rentabilidad.</w:t>
+              <w:t>El margen teórico de lista es parejo entre categorías (43,8% a 46,0%; promedio 44,9%), por lo que el mix no se explica por diferencias de rentabilidad.</w:t>
             </w:r>
           </w:p>
         </w:tc>
@@ -3678,7 +3678,7 @@
                 <w:sz w:val="16"/>
                 <w:szCs w:val="16"/>
               </w:rPr>
-              <w:t xml:space="preserve">G5</w:t>
+              <w:t>G5</w:t>
             </w:r>
           </w:p>
         </w:tc>
@@ -3736,7 +3736,7 @@
                 <w:sz w:val="16"/>
                 <w:szCs w:val="16"/>
               </w:rPr>
-              <w:t xml:space="preserve">AMBA 39,3% con 11 tiendas · Centro 21,9% (6) · NOA 17,9% (5) · Cuyo 17,2% (5) · Patagonia 3,7% (1).</w:t>
+              <w:t>AMBA 39,4% (11) · Centro 21,8% (6) · NOA 17,9% (5) · Cuyo 17,2% (5) · Patagonia 3,7% (1).</w:t>
             </w:r>
           </w:p>
         </w:tc>
@@ -3792,7 +3792,7 @@
                 <w:sz w:val="16"/>
                 <w:szCs w:val="16"/>
               </w:rPr>
-              <w:t xml:space="preserve">G6</w:t>
+              <w:t>G6</w:t>
             </w:r>
           </w:p>
         </w:tc>
@@ -3848,7 +3848,7 @@
                 <w:sz w:val="16"/>
                 <w:szCs w:val="16"/>
               </w:rPr>
-              <w:t xml:space="preserve">Muy pareja: entre 3,0% y 4,1% cada tienda. Máximo T24 con $1.342 M, mínimo T14 con $981 M. Correlación entre venta y m² de venta: −0,24.</w:t>
+              <w:t>Muy pareja: entre 3,0% y 4,1% cada tienda. Máximo T24 con $1.645 M, mínimo T14 con $1.198 M. Correlación entre venta y m² de venta: -0,21.</w:t>
             </w:r>
           </w:p>
         </w:tc>
@@ -3902,7 +3902,7 @@
                 <w:sz w:val="16"/>
                 <w:szCs w:val="16"/>
               </w:rPr>
-              <w:t xml:space="preserve">G8</w:t>
+              <w:t>G8</w:t>
             </w:r>
           </w:p>
         </w:tc>
@@ -3960,7 +3960,7 @@
                 <w:sz w:val="16"/>
                 <w:szCs w:val="16"/>
               </w:rPr>
-              <w:t xml:space="preserve">248 de 798 SKUs con venta (31,1%) explican el 80% de la facturación. El decil superior concentra el 48,7%.</w:t>
+              <w:t>250 de 798 SKUs con venta (31,3%) explican el 80% de la facturación. El decil superior concentra el 48,2%.</w:t>
             </w:r>
           </w:p>
         </w:tc>
@@ -4016,7 +4016,7 @@
                 <w:sz w:val="16"/>
                 <w:szCs w:val="16"/>
               </w:rPr>
-              <w:t xml:space="preserve">G7</w:t>
+              <w:t>G7</w:t>
             </w:r>
           </w:p>
         </w:tc>
@@ -4188,7 +4188,7 @@
                 <w:sz w:val="16"/>
                 <w:szCs w:val="16"/>
               </w:rPr>
-              <w:t xml:space="preserve">Correlación fila a fila de 0,77.</w:t>
+              <w:t>Correlación fila a fila de 0,76.</w:t>
             </w:r>
           </w:p>
         </w:tc>
@@ -4244,7 +4244,7 @@
                 <w:sz w:val="16"/>
                 <w:szCs w:val="16"/>
               </w:rPr>
-              <w:t xml:space="preserve">G2</w:t>
+              <w:t>G2</w:t>
             </w:r>
           </w:p>
         </w:tc>
@@ -4300,7 +4300,7 @@
                 <w:sz w:val="16"/>
                 <w:szCs w:val="16"/>
               </w:rPr>
-              <w:t xml:space="preserve">Entre 5,2 y 5,3 meses de forma estable en todo el período, según cuatro definiciones alternativas de cálculo.</w:t>
+              <w:t>Estable en ~5,2-5,3 meses entre 2023 y 2025 con tres de las cuatro definiciones; a ago-26, entre 4,7 y 5,0 meses. Solo la definición del TP1 (stock / promedio de 12 meses) muestra una baja de 10,7 a 5,2, por el arranque de 2022.</w:t>
             </w:r>
           </w:p>
         </w:tc>
@@ -4327,7 +4327,7 @@
                 <w:sz w:val="16"/>
                 <w:szCs w:val="16"/>
               </w:rPr>
-              <w:t xml:space="preserve">La cobertura se mantiene estable pese a que el negocio multiplicó su tamaño por dos entre 2023 y 2025: el abastecimiento acompaña a la venta.</w:t>
+              <w:t>La mediana está estable, pero la cola se engorda en 2026: el percentil 90 por posición pasa de 9 a 12 meses y el 99 de 16 a 48. El riesgo de baja rotación se concentra en pocas posiciones, no en el promedio.</w:t>
             </w:r>
           </w:p>
         </w:tc>
@@ -4354,7 +4354,7 @@
                 <w:sz w:val="16"/>
                 <w:szCs w:val="16"/>
               </w:rPr>
-              <w:t xml:space="preserve">G3</w:t>
+              <w:t>G3</w:t>
             </w:r>
           </w:p>
         </w:tc>
@@ -4412,7 +4412,7 @@
                 <w:sz w:val="16"/>
                 <w:szCs w:val="16"/>
               </w:rPr>
-              <w:t xml:space="preserve">Cumplimiento de 90,6% (2022), 91,0%, 91,5% y 91,7% (2025). Por categoría entre 90,6% y 92,1%; por tienda entre 90,1% y 92,2%.</w:t>
+              <w:t>Cumplimiento, sin las celdas en cero ni negativas: 89,5% (2022) · 89,9% · 90,3% · 90,5% · 90,9% (2026). Por categoría entre 89,6% y 91,0%; por tienda entre 89,3% y 91,4%.</w:t>
             </w:r>
           </w:p>
         </w:tc>
@@ -4440,7 +4440,7 @@
                 <w:sz w:val="16"/>
                 <w:szCs w:val="16"/>
               </w:rPr>
-              <w:t xml:space="preserve">La uniformidad del cumplimiento en todos los niveles de apertura sugiere que el presupuesto se construye como un porcentaje de la venta esperada más que como una meta independiente.</w:t>
+              <w:t>La uniformidad del cumplimiento en todos los niveles de apertura, incluso en 2026 con la venta en caída, sugiere que el presupuesto se construye como un porcentaje de la venta esperada más que como una meta independiente.</w:t>
             </w:r>
           </w:p>
         </w:tc>
@@ -4468,7 +4468,7 @@
                 <w:sz w:val="16"/>
                 <w:szCs w:val="16"/>
               </w:rPr>
-              <w:t xml:space="preserve">G9</w:t>
+              <w:t>G9</w:t>
             </w:r>
           </w:p>
         </w:tc>
@@ -4524,7 +4524,7 @@
                 <w:sz w:val="16"/>
                 <w:szCs w:val="16"/>
               </w:rPr>
-              <w:t xml:space="preserve">2.317 devoluciones por 9.583 unidades, equivalentes a ~1,3% de las unidades vendidas, estable por año.</w:t>
+              <w:t>2.317 devoluciones por 9.583 unidades entre mar-2022 y dic-2025, equivalentes al 1,3% de las unidades vendidas. No hay registros de 2026.</w:t>
             </w:r>
           </w:p>
         </w:tc>
@@ -4551,7 +4551,7 @@
                 <w:sz w:val="16"/>
                 <w:szCs w:val="16"/>
               </w:rPr>
-              <w:t xml:space="preserve">Los motivos se reparten de forma pareja: dañado en logística 2.067 uds · sin rotación 2.013 · devolución de cliente 1.930 · error de picking 1.787 · defecto de fabricación 1.786.</w:t>
+              <w:t>Los motivos se reparten de forma pareja. «Sin rotación / no vendido» (2.013 uds) es devolución al proveedor: el negocio la reconoce como movimiento de inventario, aunque el sistema la registra como venta negativa.</w:t>
             </w:r>
           </w:p>
         </w:tc>
@@ -4578,7 +4578,7 @@
                 <w:sz w:val="16"/>
                 <w:szCs w:val="16"/>
               </w:rPr>
-              <w:t xml:space="preserve">G10</w:t>
+              <w:t>G10</w:t>
             </w:r>
           </w:p>
         </w:tc>
@@ -4636,7 +4636,7 @@
                 <w:sz w:val="16"/>
                 <w:szCs w:val="16"/>
               </w:rPr>
-              <w:t xml:space="preserve">El lead time real de las órdenes de compra coincide con el declarado en Proveedores (real = declarado + 1 día, rango ±4). Ninguna orden por debajo del pedido mínimo.</w:t>
+              <w:t>El lead time real de las órdenes de compra coincide con el declarado en Proveedores (real = declarado + 1 día en promedio, rango -3 a +5), incluidas las órdenes de 2026. Ninguna orden por debajo del pedido mínimo.</w:t>
             </w:r>
           </w:p>
         </w:tc>
@@ -4692,7 +4692,7 @@
                 <w:sz w:val="16"/>
                 <w:szCs w:val="16"/>
               </w:rPr>
-              <w:t xml:space="preserve">G11</w:t>
+              <w:t>G11</w:t>
             </w:r>
           </w:p>
         </w:tc>
@@ -4748,7 +4748,7 @@
                 <w:sz w:val="16"/>
                 <w:szCs w:val="16"/>
               </w:rPr>
-              <w:t xml:space="preserve">El precio implícito de las ventas se ubica entre 85% y 100% del precio de lista actual del catálogo en el 100% de las filas. Comparado con el precio vigente según Historial_Precios, supera 1,5 veces ese valor en el 39% de los casos.</w:t>
+              <w:t>El precio implícito de las ventas se ubica entre 85% y 99% del precio de lista actual del catálogo. Comparado con el precio vigente según Historial_Precios, lo supera en más de 1,5 veces en el 33% de las filas (máximo 5,4 veces).</w:t>
             </w:r>
           </w:p>
         </w:tc>
@@ -4775,7 +4775,7 @@
                 <w:sz w:val="16"/>
                 <w:szCs w:val="16"/>
               </w:rPr>
-              <w:t xml:space="preserve">Las ventas parecen valuadas con el precio vigente actual y no con el precio histórico de cada mes, lo que limita cualquier análisis de elasticidad o de impacto de descuentos.</w:t>
+              <w:t>Las ventas están valuadas con el precio actual y no con el de cada mes. El negocio confirmó que el historial es una reconstrucción retroactiva hecha para el proyecto, no un registro del sistema.</w:t>
             </w:r>
           </w:p>
         </w:tc>
@@ -4802,7 +4802,7 @@
                 <w:sz w:val="16"/>
                 <w:szCs w:val="16"/>
               </w:rPr>
-              <w:t xml:space="preserve">—</w:t>
+              <w:t>—</w:t>
             </w:r>
           </w:p>
         </w:tc>
@@ -4860,7 +4860,7 @@
                 <w:sz w:val="16"/>
                 <w:szCs w:val="16"/>
               </w:rPr>
-              <w:t xml:space="preserve">En dic-2025 el stock en tránsito registra 23.528 unidades, mientras que las transferencias en curso a fin de mes explican 868. Correlación de 0,89 entre ambas series.</w:t>
+              <w:t>En ago-2026 el stock en tránsito registra 8.771 unidades, mientras que las transferencias en curso a fin de mes explican 936. Correlación de 0,89 entre ambas series.</w:t>
             </w:r>
           </w:p>
         </w:tc>
@@ -4888,7 +4888,7 @@
                 <w:sz w:val="16"/>
                 <w:szCs w:val="16"/>
               </w:rPr>
-              <w:t xml:space="preserve">Las series se mueven juntas pero difieren en escala aproximadamente 20 veces: el campo de tránsito debe incluir mercadería de otro origen, probablemente órdenes de compra pendientes de recepción.</w:t>
+              <w:t>La brecha se achicó (a dic-2025 era de 20 veces) pero sigue en 9 veces: el campo debe incluir mercadería de otro origen, probablemente órdenes de compra pendientes de recepción. No tiene definición documentada.</w:t>
             </w:r>
           </w:p>
         </w:tc>
@@ -4916,7 +4916,7 @@
                 <w:sz w:val="16"/>
                 <w:szCs w:val="16"/>
               </w:rPr>
-              <w:t xml:space="preserve">—</w:t>
+              <w:t>—</w:t>
             </w:r>
           </w:p>
         </w:tc>
@@ -5784,7 +5784,7 @@
         <w:tc>
           <w:tcPr>
             <w:tcW w:type="dxa" w:w="1000"/>
-            <w:shd w:fill="C6EFCE" w:color="auto" w:val="clear"/>
+            <w:shd w:fill="FFC7CE" w:color="auto" w:val="clear"/>
             <w:tcMar>
               <w:top w:type="dxa" w:w="50"/>
               <w:left w:type="dxa" w:w="80"/>
@@ -5805,7 +5805,7 @@
                 <w:sz w:val="15"/>
                 <w:szCs w:val="15"/>
               </w:rPr>
-              <w:t xml:space="preserve">Verde</w:t>
+              <w:t>Rojo</w:t>
             </w:r>
           </w:p>
         </w:tc>
@@ -6235,7 +6235,7 @@
         <w:tc>
           <w:tcPr>
             <w:tcW w:type="dxa" w:w="1000"/>
-            <w:shd w:fill="C6EFCE" w:color="auto" w:val="clear"/>
+            <w:shd w:fill="FFC7CE" w:color="auto" w:val="clear"/>
             <w:tcMar>
               <w:top w:type="dxa" w:w="50"/>
               <w:left w:type="dxa" w:w="80"/>
@@ -6256,7 +6256,7 @@
                 <w:sz w:val="15"/>
                 <w:szCs w:val="15"/>
               </w:rPr>
-              <w:t xml:space="preserve">Verde</w:t>
+              <w:t>Rojo</w:t>
             </w:r>
           </w:p>
         </w:tc>
@@ -6686,7 +6686,7 @@
         <w:tc>
           <w:tcPr>
             <w:tcW w:type="dxa" w:w="1000"/>
-            <w:shd w:fill="C6EFCE" w:color="auto" w:val="clear"/>
+            <w:shd w:fill="FFC7CE" w:color="auto" w:val="clear"/>
             <w:tcMar>
               <w:top w:type="dxa" w:w="50"/>
               <w:left w:type="dxa" w:w="80"/>
@@ -6707,7 +6707,7 @@
                 <w:sz w:val="15"/>
                 <w:szCs w:val="15"/>
               </w:rPr>
-              <w:t xml:space="preserve">Verde</w:t>
+              <w:t>Rojo</w:t>
             </w:r>
           </w:p>
         </w:tc>
@@ -8815,7 +8815,7 @@
                 <w:sz w:val="16"/>
                 <w:szCs w:val="16"/>
               </w:rPr>
-              <w:t xml:space="preserve">10.903 filas por $1.475,9 M registran venta en seis tiendas con anterioridad a su fecha de apertura declarada. El caso extremo es T25 Córdoba, con 36 meses de venta previos a la apertura.</w:t>
+              <w:t>11.058 filas por $1.471,7 M registran venta en seis tiendas con anterioridad a su fecha de apertura declarada. El caso extremo es T25 Córdoba, con 36 meses de venta previos a la apertura.</w:t>
             </w:r>
           </w:p>
         </w:tc>
@@ -8929,7 +8929,7 @@
                 <w:sz w:val="16"/>
                 <w:szCs w:val="16"/>
               </w:rPr>
-              <w:t xml:space="preserve">1.790 filas registran venta mayor a cero con stock en cero el mismo mes, y 4.282 registran venta superior al stock disponible.</w:t>
+              <w:t>1.020 filas registran venta mayor a cero con stock en cero el mismo mes (187 en 2026), y 5.727 registran venta superior al stock disponible (449 en 2026). Es el único problema de consistencia que persiste en el tramo 2026.</w:t>
             </w:r>
           </w:p>
         </w:tc>
@@ -9157,7 +9157,7 @@
                 <w:sz w:val="16"/>
                 <w:szCs w:val="16"/>
               </w:rPr>
-              <w:t xml:space="preserve">79 de las 93 liquidaciones con motivo «Discontinuación» corresponden a SKUs que figuran como Activos en el catálogo. 278 de las 496 liquidaciones con tienda asignada recaen sobre posiciones sin stock en ese mes.</w:t>
+              <w:t>90 de las 108 liquidaciones con motivo «Discontinuación» corresponden a SKUs que figuran como Activos en el catálogo. 12 registros usan «Todas» como tienda, que no es un identificador válido.</w:t>
             </w:r>
           </w:p>
         </w:tc>
@@ -9213,7 +9213,7 @@
                 <w:sz w:val="16"/>
                 <w:szCs w:val="16"/>
               </w:rPr>
-              <w:t xml:space="preserve">El precio implícito de las ventas supera en más de 1,5 veces al precio vigente según el historial en el 39% de las filas, llegando hasta 4,9 veces.</w:t>
+              <w:t>El precio implícito de las ventas supera en más de 1,5 veces al precio vigente según el historial en el 33% de las filas, llegando hasta 5,4 veces.</w:t>
             </w:r>
           </w:p>
         </w:tc>
@@ -9385,7 +9385,65 @@
                 <w:sz w:val="16"/>
                 <w:szCs w:val="16"/>
               </w:rPr>
-              <w:t xml:space="preserve">Las transferencias no explican el volumen del campo stock_en_tránsito: 868 unidades contra 23.528 registradas en Stock a dic-2025. Además, 1.803 de las 4.200 transferencias tienen como destino una posición sin registro de stock en ese mes.</w:t>
+              <w:t>Las transferencias no explican el volumen del campo stock_en_tránsito: 936 unidades contra 8.771 registradas en Stock a ago-2026 (a dic-2025, 868 contra 23.528).</w:t>
+            </w:r>
+          </w:p>
+        </w:tc>
+      </w:tr>
+      <w:tr>
+        <w:tc>
+          <w:tcPr>
+            <w:tcW w:type="dxa" w:w="2400"/>
+            <w:shd w:fill="F2F2F2" w:color="auto" w:val="clear"/>
+            <w:tcMar>
+              <w:top w:type="dxa" w:w="50"/>
+              <w:left w:type="dxa" w:w="80"/>
+              <w:bottom w:type="dxa" w:w="50"/>
+              <w:right w:type="dxa" w:w="80"/>
+            </w:tcMar>
+          </w:tcPr>
+          <w:p>
+            <w:pPr>
+              <w:spacing w:line="240"/>
+              <w:jc w:val="left"/>
+            </w:pPr>
+            <w:r>
+              <w:rPr>
+                <w:b w:val="false"/>
+                <w:bCs w:val="false"/>
+                <w:color w:val="000000"/>
+                <w:sz w:val="16"/>
+                <w:szCs w:val="16"/>
+              </w:rPr>
+              <w:t>Productos_catalogo, Calendario y Devoluciones — Actualidad</w:t>
+            </w:r>
+          </w:p>
+        </w:tc>
+        <w:tc>
+          <w:tcPr>
+            <w:tcW w:type="dxa" w:w="6600"/>
+            <w:shd w:fill="F2F2F2" w:color="auto" w:val="clear"/>
+            <w:tcMar>
+              <w:top w:type="dxa" w:w="50"/>
+              <w:left w:type="dxa" w:w="80"/>
+              <w:bottom w:type="dxa" w:w="50"/>
+              <w:right w:type="dxa" w:w="80"/>
+            </w:tcMar>
+          </w:tcPr>
+          <w:p>
+            <w:pPr>
+              <w:spacing w:line="240"/>
+              <w:jc w:val="left"/>
+            </w:pPr>
+            <w:r>
+              <w:rPr>
+                <w:b w:val="false"/>
+                <w:bCs w:val="false"/>
+                <w:color w:val="000000"/>
+                <w:sz w:val="16"/>
+                <w:szCs w:val="16"/>
+              </w:rPr>
+              <w:t>Ventas y Stock llegan a agosto de 2026, pero Devoluciones y Calendario terminan en diciembre de 2025 y el catálogo no registra altas ni bajas desde junio de 2025. No se puede calcular la tasa de devolución de 2026 ni identificar productos discontinuados en ese año.</w:t>
             </w:r>
           </w:p>
         </w:tc>
@@ -9474,7 +9532,7 @@
           <w:sz w:val="21"/>
           <w:szCs w:val="21"/>
         </w:rPr>
-        <w:t xml:space="preserve">Actualidad: vigencia del dato respecto del corte de análisis de diciembre de 2025.</w:t>
+        <w:t>Actualidad: vigencia del dato respecto del corte de análisis de agosto de 2026.</w:t>
       </w:r>
     </w:p>
     <w:p>
@@ -9562,7 +9620,7 @@
           <w:sz w:val="21"/>
           <w:szCs w:val="21"/>
         </w:rPr>
-        <w:t xml:space="preserve">Los gráficos se generaron sobre las 15 fuentes de datos con corte en diciembre de 2025.</w:t>
+        <w:t>Los gráficos se generaron sobre las 15 fuentes de datos con corte en agosto de 2026 (script EDA/eda_ago26.py). La franja sombreada marca el tramo 2026.</w:t>
       </w:r>
     </w:p>
     <w:p>
@@ -9572,37 +9630,31 @@
       </w:pPr>
       <w:r>
         <w:drawing>
-          <wp:inline distT="0" distB="0" distL="0" distR="0">
-            <wp:extent cx="5334000" cy="1943100"/>
-            <wp:effectExtent t="0" r="0" b="0" l="0"/>
-            <wp:docPr id="1" name="" descr="" title=""/>
+          <wp:inline xmlns:a="http://schemas.openxmlformats.org/drawingml/2006/main" xmlns:pic="http://schemas.openxmlformats.org/drawingml/2006/picture">
+            <wp:extent cx="5334000" cy="2240280"/>
+            <wp:docPr id="2" name="Picture 2"/>
             <wp:cNvGraphicFramePr>
-              <a:graphicFrameLocks xmlns:a="http://schemas.openxmlformats.org/drawingml/2006/main" noChangeAspect="1"/>
+              <a:graphicFrameLocks noChangeAspect="1"/>
             </wp:cNvGraphicFramePr>
-            <a:graphic xmlns:a="http://schemas.openxmlformats.org/drawingml/2006/main">
+            <a:graphic>
               <a:graphicData uri="http://schemas.openxmlformats.org/drawingml/2006/picture">
-                <pic:pic xmlns:pic="http://schemas.openxmlformats.org/drawingml/2006/picture">
+                <pic:pic>
                   <pic:nvPicPr>
-                    <pic:cNvPr id="0" name="" descr=""/>
-                    <pic:cNvPicPr>
-                      <a:picLocks noChangeAspect="1" noChangeArrowheads="1"/>
-                    </pic:cNvPicPr>
+                    <pic:cNvPr id="0" name="G01_venta_mensual.png"/>
+                    <pic:cNvPicPr/>
                   </pic:nvPicPr>
                   <pic:blipFill>
-                    <a:blip r:embed="rId9" cstate="none"/>
-                    <a:srcRect/>
+                    <a:blip r:embed="rId22"/>
                     <a:stretch>
                       <a:fillRect/>
                     </a:stretch>
                   </pic:blipFill>
-                  <pic:spPr bwMode="auto">
+                  <pic:spPr>
                     <a:xfrm>
                       <a:off x="0" y="0"/>
-                      <a:ext cx="5334000" cy="1943100"/>
+                      <a:ext cx="5334000" cy="2240280"/>
                     </a:xfrm>
-                    <a:prstGeom prst="rect">
-                      <a:avLst/>
-                    </a:prstGeom>
+                    <a:prstGeom prst="rect"/>
                   </pic:spPr>
                 </pic:pic>
               </a:graphicData>
@@ -9624,7 +9676,7 @@
           <w:sz w:val="17"/>
           <w:szCs w:val="17"/>
         </w:rPr>
-        <w:t xml:space="preserve">G1 · Evolución mensual de la venta neta y de las unidades vendidas (2022-2025)</w:t>
+        <w:t>G1 · Evolución mensual de la venta neta y de las unidades vendidas (ene-2022 a ago-2026)</w:t>
       </w:r>
     </w:p>
     <w:p>
@@ -9634,37 +9686,31 @@
       </w:pPr>
       <w:r>
         <w:drawing>
-          <wp:inline distT="0" distB="0" distL="0" distR="0">
-            <wp:extent cx="5334000" cy="1943100"/>
-            <wp:effectExtent t="0" r="0" b="0" l="0"/>
-            <wp:docPr id="1" name="" descr="" title=""/>
+          <wp:inline xmlns:a="http://schemas.openxmlformats.org/drawingml/2006/main" xmlns:pic="http://schemas.openxmlformats.org/drawingml/2006/picture">
+            <wp:extent cx="5334000" cy="3810000"/>
+            <wp:docPr id="3" name="Picture 3"/>
             <wp:cNvGraphicFramePr>
-              <a:graphicFrameLocks xmlns:a="http://schemas.openxmlformats.org/drawingml/2006/main" noChangeAspect="1"/>
+              <a:graphicFrameLocks noChangeAspect="1"/>
             </wp:cNvGraphicFramePr>
-            <a:graphic xmlns:a="http://schemas.openxmlformats.org/drawingml/2006/main">
+            <a:graphic>
               <a:graphicData uri="http://schemas.openxmlformats.org/drawingml/2006/picture">
-                <pic:pic xmlns:pic="http://schemas.openxmlformats.org/drawingml/2006/picture">
+                <pic:pic>
                   <pic:nvPicPr>
-                    <pic:cNvPr id="0" name="" descr=""/>
-                    <pic:cNvPicPr>
-                      <a:picLocks noChangeAspect="1" noChangeArrowheads="1"/>
-                    </pic:cNvPicPr>
+                    <pic:cNvPr id="0" name="G02_unidades_vs_stock.png"/>
+                    <pic:cNvPicPr/>
                   </pic:nvPicPr>
                   <pic:blipFill>
-                    <a:blip r:embed="rId10" cstate="none"/>
-                    <a:srcRect/>
+                    <a:blip r:embed="rId23"/>
                     <a:stretch>
                       <a:fillRect/>
                     </a:stretch>
                   </pic:blipFill>
-                  <pic:spPr bwMode="auto">
+                  <pic:spPr>
                     <a:xfrm>
                       <a:off x="0" y="0"/>
-                      <a:ext cx="5334000" cy="1943100"/>
+                      <a:ext cx="5334000" cy="3810000"/>
                     </a:xfrm>
-                    <a:prstGeom prst="rect">
-                      <a:avLst/>
-                    </a:prstGeom>
+                    <a:prstGeom prst="rect"/>
                   </pic:spPr>
                 </pic:pic>
               </a:graphicData>
@@ -9696,37 +9742,31 @@
       </w:pPr>
       <w:r>
         <w:drawing>
-          <wp:inline distT="0" distB="0" distL="0" distR="0">
-            <wp:extent cx="5334000" cy="1943100"/>
-            <wp:effectExtent t="0" r="0" b="0" l="0"/>
-            <wp:docPr id="1" name="" descr="" title=""/>
+          <wp:inline xmlns:a="http://schemas.openxmlformats.org/drawingml/2006/main" xmlns:pic="http://schemas.openxmlformats.org/drawingml/2006/picture">
+            <wp:extent cx="5334000" cy="2240280"/>
+            <wp:docPr id="4" name="Picture 4"/>
             <wp:cNvGraphicFramePr>
-              <a:graphicFrameLocks xmlns:a="http://schemas.openxmlformats.org/drawingml/2006/main" noChangeAspect="1"/>
+              <a:graphicFrameLocks noChangeAspect="1"/>
             </wp:cNvGraphicFramePr>
-            <a:graphic xmlns:a="http://schemas.openxmlformats.org/drawingml/2006/main">
+            <a:graphic>
               <a:graphicData uri="http://schemas.openxmlformats.org/drawingml/2006/picture">
-                <pic:pic xmlns:pic="http://schemas.openxmlformats.org/drawingml/2006/picture">
+                <pic:pic>
                   <pic:nvPicPr>
-                    <pic:cNvPr id="0" name="" descr=""/>
-                    <pic:cNvPicPr>
-                      <a:picLocks noChangeAspect="1" noChangeArrowheads="1"/>
-                    </pic:cNvPicPr>
+                    <pic:cNvPr id="0" name="G03_cobertura.png"/>
+                    <pic:cNvPicPr/>
                   </pic:nvPicPr>
                   <pic:blipFill>
-                    <a:blip r:embed="rId11" cstate="none"/>
-                    <a:srcRect/>
+                    <a:blip r:embed="rId24"/>
                     <a:stretch>
                       <a:fillRect/>
                     </a:stretch>
                   </pic:blipFill>
-                  <pic:spPr bwMode="auto">
+                  <pic:spPr>
                     <a:xfrm>
                       <a:off x="0" y="0"/>
-                      <a:ext cx="5334000" cy="1943100"/>
+                      <a:ext cx="5334000" cy="2240280"/>
                     </a:xfrm>
-                    <a:prstGeom prst="rect">
-                      <a:avLst/>
-                    </a:prstGeom>
+                    <a:prstGeom prst="rect"/>
                   </pic:spPr>
                 </pic:pic>
               </a:graphicData>
@@ -9758,37 +9798,31 @@
       </w:pPr>
       <w:r>
         <w:drawing>
-          <wp:inline distT="0" distB="0" distL="0" distR="0">
-            <wp:extent cx="5334000" cy="2667000"/>
-            <wp:effectExtent t="0" r="0" b="0" l="0"/>
-            <wp:docPr id="1" name="" descr="" title=""/>
+          <wp:inline xmlns:a="http://schemas.openxmlformats.org/drawingml/2006/main" xmlns:pic="http://schemas.openxmlformats.org/drawingml/2006/picture">
+            <wp:extent cx="5334000" cy="2370667"/>
+            <wp:docPr id="5" name="Picture 5"/>
             <wp:cNvGraphicFramePr>
-              <a:graphicFrameLocks xmlns:a="http://schemas.openxmlformats.org/drawingml/2006/main" noChangeAspect="1"/>
+              <a:graphicFrameLocks noChangeAspect="1"/>
             </wp:cNvGraphicFramePr>
-            <a:graphic xmlns:a="http://schemas.openxmlformats.org/drawingml/2006/main">
+            <a:graphic>
               <a:graphicData uri="http://schemas.openxmlformats.org/drawingml/2006/picture">
-                <pic:pic xmlns:pic="http://schemas.openxmlformats.org/drawingml/2006/picture">
+                <pic:pic>
                   <pic:nvPicPr>
-                    <pic:cNvPr id="0" name="" descr=""/>
-                    <pic:cNvPicPr>
-                      <a:picLocks noChangeAspect="1" noChangeArrowheads="1"/>
-                    </pic:cNvPicPr>
+                    <pic:cNvPr id="0" name="G04_estacionalidad.png"/>
+                    <pic:cNvPicPr/>
                   </pic:nvPicPr>
                   <pic:blipFill>
-                    <a:blip r:embed="rId12" cstate="none"/>
-                    <a:srcRect/>
+                    <a:blip r:embed="rId25"/>
                     <a:stretch>
                       <a:fillRect/>
                     </a:stretch>
                   </pic:blipFill>
-                  <pic:spPr bwMode="auto">
+                  <pic:spPr>
                     <a:xfrm>
                       <a:off x="0" y="0"/>
-                      <a:ext cx="5334000" cy="2667000"/>
+                      <a:ext cx="5334000" cy="2370667"/>
                     </a:xfrm>
-                    <a:prstGeom prst="rect">
-                      <a:avLst/>
-                    </a:prstGeom>
+                    <a:prstGeom prst="rect"/>
                   </pic:spPr>
                 </pic:pic>
               </a:graphicData>
@@ -9820,37 +9854,31 @@
       </w:pPr>
       <w:r>
         <w:drawing>
-          <wp:inline distT="0" distB="0" distL="0" distR="0">
-            <wp:extent cx="5334000" cy="2667000"/>
-            <wp:effectExtent t="0" r="0" b="0" l="0"/>
-            <wp:docPr id="1" name="" descr="" title=""/>
+          <wp:inline xmlns:a="http://schemas.openxmlformats.org/drawingml/2006/main" xmlns:pic="http://schemas.openxmlformats.org/drawingml/2006/picture">
+            <wp:extent cx="5334000" cy="2489200"/>
+            <wp:docPr id="6" name="Picture 6"/>
             <wp:cNvGraphicFramePr>
-              <a:graphicFrameLocks xmlns:a="http://schemas.openxmlformats.org/drawingml/2006/main" noChangeAspect="1"/>
+              <a:graphicFrameLocks noChangeAspect="1"/>
             </wp:cNvGraphicFramePr>
-            <a:graphic xmlns:a="http://schemas.openxmlformats.org/drawingml/2006/main">
+            <a:graphic>
               <a:graphicData uri="http://schemas.openxmlformats.org/drawingml/2006/picture">
-                <pic:pic xmlns:pic="http://schemas.openxmlformats.org/drawingml/2006/picture">
+                <pic:pic>
                   <pic:nvPicPr>
-                    <pic:cNvPr id="0" name="" descr=""/>
-                    <pic:cNvPicPr>
-                      <a:picLocks noChangeAspect="1" noChangeArrowheads="1"/>
-                    </pic:cNvPicPr>
+                    <pic:cNvPr id="0" name="G05_categorias.png"/>
+                    <pic:cNvPicPr/>
                   </pic:nvPicPr>
                   <pic:blipFill>
-                    <a:blip r:embed="rId13" cstate="none"/>
-                    <a:srcRect/>
+                    <a:blip r:embed="rId26"/>
                     <a:stretch>
                       <a:fillRect/>
                     </a:stretch>
                   </pic:blipFill>
-                  <pic:spPr bwMode="auto">
+                  <pic:spPr>
                     <a:xfrm>
                       <a:off x="0" y="0"/>
-                      <a:ext cx="5334000" cy="2667000"/>
+                      <a:ext cx="5334000" cy="2489200"/>
                     </a:xfrm>
-                    <a:prstGeom prst="rect">
-                      <a:avLst/>
-                    </a:prstGeom>
+                    <a:prstGeom prst="rect"/>
                   </pic:spPr>
                 </pic:pic>
               </a:graphicData>
@@ -9882,37 +9910,31 @@
       </w:pPr>
       <w:r>
         <w:drawing>
-          <wp:inline distT="0" distB="0" distL="0" distR="0">
-            <wp:extent cx="5334000" cy="3048000"/>
-            <wp:effectExtent t="0" r="0" b="0" l="0"/>
-            <wp:docPr id="1" name="" descr="" title=""/>
+          <wp:inline xmlns:a="http://schemas.openxmlformats.org/drawingml/2006/main" xmlns:pic="http://schemas.openxmlformats.org/drawingml/2006/picture">
+            <wp:extent cx="5334000" cy="2400300"/>
+            <wp:docPr id="7" name="Picture 7"/>
             <wp:cNvGraphicFramePr>
-              <a:graphicFrameLocks xmlns:a="http://schemas.openxmlformats.org/drawingml/2006/main" noChangeAspect="1"/>
+              <a:graphicFrameLocks noChangeAspect="1"/>
             </wp:cNvGraphicFramePr>
-            <a:graphic xmlns:a="http://schemas.openxmlformats.org/drawingml/2006/main">
+            <a:graphic>
               <a:graphicData uri="http://schemas.openxmlformats.org/drawingml/2006/picture">
-                <pic:pic xmlns:pic="http://schemas.openxmlformats.org/drawingml/2006/picture">
+                <pic:pic>
                   <pic:nvPicPr>
-                    <pic:cNvPr id="0" name="" descr=""/>
-                    <pic:cNvPicPr>
-                      <a:picLocks noChangeAspect="1" noChangeArrowheads="1"/>
-                    </pic:cNvPicPr>
+                    <pic:cNvPr id="0" name="G06_region.png"/>
+                    <pic:cNvPicPr/>
                   </pic:nvPicPr>
                   <pic:blipFill>
-                    <a:blip r:embed="rId14" cstate="none"/>
-                    <a:srcRect/>
+                    <a:blip r:embed="rId27"/>
                     <a:stretch>
                       <a:fillRect/>
                     </a:stretch>
                   </pic:blipFill>
-                  <pic:spPr bwMode="auto">
+                  <pic:spPr>
                     <a:xfrm>
                       <a:off x="0" y="0"/>
-                      <a:ext cx="5334000" cy="3048000"/>
+                      <a:ext cx="5334000" cy="2400300"/>
                     </a:xfrm>
-                    <a:prstGeom prst="rect">
-                      <a:avLst/>
-                    </a:prstGeom>
+                    <a:prstGeom prst="rect"/>
                   </pic:spPr>
                 </pic:pic>
               </a:graphicData>
@@ -9934,7 +9956,7 @@
           <w:sz w:val="17"/>
           <w:szCs w:val="17"/>
         </w:rPr>
-        <w:t xml:space="preserve">G6 · Distribución de la venta por región</w:t>
+        <w:t>G6 · Venta por región frente a su peso en la red de tiendas</w:t>
       </w:r>
     </w:p>
     <w:p>
@@ -9944,37 +9966,31 @@
       </w:pPr>
       <w:r>
         <w:drawing>
-          <wp:inline distT="0" distB="0" distL="0" distR="0">
-            <wp:extent cx="5334000" cy="2667000"/>
-            <wp:effectExtent t="0" r="0" b="0" l="0"/>
-            <wp:docPr id="1" name="" descr="" title=""/>
+          <wp:inline xmlns:a="http://schemas.openxmlformats.org/drawingml/2006/main" xmlns:pic="http://schemas.openxmlformats.org/drawingml/2006/picture">
+            <wp:extent cx="5334000" cy="3200400"/>
+            <wp:docPr id="8" name="Picture 8"/>
             <wp:cNvGraphicFramePr>
-              <a:graphicFrameLocks xmlns:a="http://schemas.openxmlformats.org/drawingml/2006/main" noChangeAspect="1"/>
+              <a:graphicFrameLocks noChangeAspect="1"/>
             </wp:cNvGraphicFramePr>
-            <a:graphic xmlns:a="http://schemas.openxmlformats.org/drawingml/2006/main">
+            <a:graphic>
               <a:graphicData uri="http://schemas.openxmlformats.org/drawingml/2006/picture">
-                <pic:pic xmlns:pic="http://schemas.openxmlformats.org/drawingml/2006/picture">
+                <pic:pic>
                   <pic:nvPicPr>
-                    <pic:cNvPr id="0" name="" descr=""/>
-                    <pic:cNvPicPr>
-                      <a:picLocks noChangeAspect="1" noChangeArrowheads="1"/>
-                    </pic:cNvPicPr>
+                    <pic:cNvPr id="0" name="G07_pareto.png"/>
+                    <pic:cNvPicPr/>
                   </pic:nvPicPr>
                   <pic:blipFill>
-                    <a:blip r:embed="rId15" cstate="none"/>
-                    <a:srcRect/>
+                    <a:blip r:embed="rId28"/>
                     <a:stretch>
                       <a:fillRect/>
                     </a:stretch>
                   </pic:blipFill>
-                  <pic:spPr bwMode="auto">
+                  <pic:spPr>
                     <a:xfrm>
                       <a:off x="0" y="0"/>
-                      <a:ext cx="5334000" cy="2667000"/>
+                      <a:ext cx="5334000" cy="3200400"/>
                     </a:xfrm>
-                    <a:prstGeom prst="rect">
-                      <a:avLst/>
-                    </a:prstGeom>
+                    <a:prstGeom prst="rect"/>
                   </pic:spPr>
                 </pic:pic>
               </a:graphicData>
@@ -10006,37 +10022,31 @@
       </w:pPr>
       <w:r>
         <w:drawing>
-          <wp:inline distT="0" distB="0" distL="0" distR="0">
-            <wp:extent cx="5334000" cy="2428875"/>
-            <wp:effectExtent t="0" r="0" b="0" l="0"/>
-            <wp:docPr id="1" name="" descr="" title=""/>
+          <wp:inline xmlns:a="http://schemas.openxmlformats.org/drawingml/2006/main" xmlns:pic="http://schemas.openxmlformats.org/drawingml/2006/picture">
+            <wp:extent cx="5334000" cy="3000375"/>
+            <wp:docPr id="9" name="Picture 9"/>
             <wp:cNvGraphicFramePr>
-              <a:graphicFrameLocks xmlns:a="http://schemas.openxmlformats.org/drawingml/2006/main" noChangeAspect="1"/>
+              <a:graphicFrameLocks noChangeAspect="1"/>
             </wp:cNvGraphicFramePr>
-            <a:graphic xmlns:a="http://schemas.openxmlformats.org/drawingml/2006/main">
+            <a:graphic>
               <a:graphicData uri="http://schemas.openxmlformats.org/drawingml/2006/picture">
-                <pic:pic xmlns:pic="http://schemas.openxmlformats.org/drawingml/2006/picture">
+                <pic:pic>
                   <pic:nvPicPr>
-                    <pic:cNvPr id="0" name="" descr=""/>
-                    <pic:cNvPicPr>
-                      <a:picLocks noChangeAspect="1" noChangeArrowheads="1"/>
-                    </pic:cNvPicPr>
+                    <pic:cNvPr id="0" name="G08_tiendas.png"/>
+                    <pic:cNvPicPr/>
                   </pic:nvPicPr>
                   <pic:blipFill>
-                    <a:blip r:embed="rId16" cstate="none"/>
-                    <a:srcRect/>
+                    <a:blip r:embed="rId29"/>
                     <a:stretch>
                       <a:fillRect/>
                     </a:stretch>
                   </pic:blipFill>
-                  <pic:spPr bwMode="auto">
+                  <pic:spPr>
                     <a:xfrm>
                       <a:off x="0" y="0"/>
-                      <a:ext cx="5334000" cy="2428875"/>
+                      <a:ext cx="5334000" cy="3000375"/>
                     </a:xfrm>
-                    <a:prstGeom prst="rect">
-                      <a:avLst/>
-                    </a:prstGeom>
+                    <a:prstGeom prst="rect"/>
                   </pic:spPr>
                 </pic:pic>
               </a:graphicData>
@@ -10068,37 +10078,31 @@
       </w:pPr>
       <w:r>
         <w:drawing>
-          <wp:inline distT="0" distB="0" distL="0" distR="0">
-            <wp:extent cx="5334000" cy="1943100"/>
-            <wp:effectExtent t="0" r="0" b="0" l="0"/>
-            <wp:docPr id="1" name="" descr="" title=""/>
+          <wp:inline xmlns:a="http://schemas.openxmlformats.org/drawingml/2006/main" xmlns:pic="http://schemas.openxmlformats.org/drawingml/2006/picture">
+            <wp:extent cx="5334000" cy="2240280"/>
+            <wp:docPr id="10" name="Picture 10"/>
             <wp:cNvGraphicFramePr>
-              <a:graphicFrameLocks xmlns:a="http://schemas.openxmlformats.org/drawingml/2006/main" noChangeAspect="1"/>
+              <a:graphicFrameLocks noChangeAspect="1"/>
             </wp:cNvGraphicFramePr>
-            <a:graphic xmlns:a="http://schemas.openxmlformats.org/drawingml/2006/main">
+            <a:graphic>
               <a:graphicData uri="http://schemas.openxmlformats.org/drawingml/2006/picture">
-                <pic:pic xmlns:pic="http://schemas.openxmlformats.org/drawingml/2006/picture">
+                <pic:pic>
                   <pic:nvPicPr>
-                    <pic:cNvPr id="0" name="" descr=""/>
-                    <pic:cNvPicPr>
-                      <a:picLocks noChangeAspect="1" noChangeArrowheads="1"/>
-                    </pic:cNvPicPr>
+                    <pic:cNvPr id="0" name="G09_presupuesto.png"/>
+                    <pic:cNvPicPr/>
                   </pic:nvPicPr>
                   <pic:blipFill>
-                    <a:blip r:embed="rId17" cstate="none"/>
-                    <a:srcRect/>
+                    <a:blip r:embed="rId30"/>
                     <a:stretch>
                       <a:fillRect/>
                     </a:stretch>
                   </pic:blipFill>
-                  <pic:spPr bwMode="auto">
+                  <pic:spPr>
                     <a:xfrm>
                       <a:off x="0" y="0"/>
-                      <a:ext cx="5334000" cy="1943100"/>
+                      <a:ext cx="5334000" cy="2240280"/>
                     </a:xfrm>
-                    <a:prstGeom prst="rect">
-                      <a:avLst/>
-                    </a:prstGeom>
+                    <a:prstGeom prst="rect"/>
                   </pic:spPr>
                 </pic:pic>
               </a:graphicData>
@@ -10130,37 +10134,31 @@
       </w:pPr>
       <w:r>
         <w:drawing>
-          <wp:inline distT="0" distB="0" distL="0" distR="0">
-            <wp:extent cx="5334000" cy="2667000"/>
-            <wp:effectExtent t="0" r="0" b="0" l="0"/>
-            <wp:docPr id="1" name="" descr="" title=""/>
+          <wp:inline xmlns:a="http://schemas.openxmlformats.org/drawingml/2006/main" xmlns:pic="http://schemas.openxmlformats.org/drawingml/2006/picture">
+            <wp:extent cx="5334000" cy="2400300"/>
+            <wp:docPr id="11" name="Picture 11"/>
             <wp:cNvGraphicFramePr>
-              <a:graphicFrameLocks xmlns:a="http://schemas.openxmlformats.org/drawingml/2006/main" noChangeAspect="1"/>
+              <a:graphicFrameLocks noChangeAspect="1"/>
             </wp:cNvGraphicFramePr>
-            <a:graphic xmlns:a="http://schemas.openxmlformats.org/drawingml/2006/main">
+            <a:graphic>
               <a:graphicData uri="http://schemas.openxmlformats.org/drawingml/2006/picture">
-                <pic:pic xmlns:pic="http://schemas.openxmlformats.org/drawingml/2006/picture">
+                <pic:pic>
                   <pic:nvPicPr>
-                    <pic:cNvPr id="0" name="" descr=""/>
-                    <pic:cNvPicPr>
-                      <a:picLocks noChangeAspect="1" noChangeArrowheads="1"/>
-                    </pic:cNvPicPr>
+                    <pic:cNvPr id="0" name="G10_devoluciones.png"/>
+                    <pic:cNvPicPr/>
                   </pic:nvPicPr>
                   <pic:blipFill>
-                    <a:blip r:embed="rId18" cstate="none"/>
-                    <a:srcRect/>
+                    <a:blip r:embed="rId31"/>
                     <a:stretch>
                       <a:fillRect/>
                     </a:stretch>
                   </pic:blipFill>
-                  <pic:spPr bwMode="auto">
+                  <pic:spPr>
                     <a:xfrm>
                       <a:off x="0" y="0"/>
-                      <a:ext cx="5334000" cy="2667000"/>
+                      <a:ext cx="5334000" cy="2400300"/>
                     </a:xfrm>
-                    <a:prstGeom prst="rect">
-                      <a:avLst/>
-                    </a:prstGeom>
+                    <a:prstGeom prst="rect"/>
                   </pic:spPr>
                 </pic:pic>
               </a:graphicData>
@@ -10192,37 +10190,31 @@
       </w:pPr>
       <w:r>
         <w:drawing>
-          <wp:inline distT="0" distB="0" distL="0" distR="0">
+          <wp:inline xmlns:a="http://schemas.openxmlformats.org/drawingml/2006/main" xmlns:pic="http://schemas.openxmlformats.org/drawingml/2006/picture">
             <wp:extent cx="5334000" cy="2667000"/>
-            <wp:effectExtent t="0" r="0" b="0" l="0"/>
-            <wp:docPr id="1" name="" descr="" title=""/>
+            <wp:docPr id="12" name="Picture 12"/>
             <wp:cNvGraphicFramePr>
-              <a:graphicFrameLocks xmlns:a="http://schemas.openxmlformats.org/drawingml/2006/main" noChangeAspect="1"/>
+              <a:graphicFrameLocks noChangeAspect="1"/>
             </wp:cNvGraphicFramePr>
-            <a:graphic xmlns:a="http://schemas.openxmlformats.org/drawingml/2006/main">
+            <a:graphic>
               <a:graphicData uri="http://schemas.openxmlformats.org/drawingml/2006/picture">
-                <pic:pic xmlns:pic="http://schemas.openxmlformats.org/drawingml/2006/picture">
+                <pic:pic>
                   <pic:nvPicPr>
-                    <pic:cNvPr id="0" name="" descr=""/>
-                    <pic:cNvPicPr>
-                      <a:picLocks noChangeAspect="1" noChangeArrowheads="1"/>
-                    </pic:cNvPicPr>
+                    <pic:cNvPr id="0" name="G11_leadtime.png"/>
+                    <pic:cNvPicPr/>
                   </pic:nvPicPr>
                   <pic:blipFill>
-                    <a:blip r:embed="rId19" cstate="none"/>
-                    <a:srcRect/>
+                    <a:blip r:embed="rId32"/>
                     <a:stretch>
                       <a:fillRect/>
                     </a:stretch>
                   </pic:blipFill>
-                  <pic:spPr bwMode="auto">
+                  <pic:spPr>
                     <a:xfrm>
                       <a:off x="0" y="0"/>
                       <a:ext cx="5334000" cy="2667000"/>
                     </a:xfrm>
-                    <a:prstGeom prst="rect">
-                      <a:avLst/>
-                    </a:prstGeom>
+                    <a:prstGeom prst="rect"/>
                   </pic:spPr>
                 </pic:pic>
               </a:graphicData>
@@ -10254,37 +10246,31 @@
       </w:pPr>
       <w:r>
         <w:drawing>
-          <wp:inline distT="0" distB="0" distL="0" distR="0">
-            <wp:extent cx="5334000" cy="1943100"/>
-            <wp:effectExtent t="0" r="0" b="0" l="0"/>
-            <wp:docPr id="1" name="" descr="" title=""/>
+          <wp:inline xmlns:a="http://schemas.openxmlformats.org/drawingml/2006/main" xmlns:pic="http://schemas.openxmlformats.org/drawingml/2006/picture">
+            <wp:extent cx="5334000" cy="1600200"/>
+            <wp:docPr id="13" name="Picture 13"/>
             <wp:cNvGraphicFramePr>
-              <a:graphicFrameLocks xmlns:a="http://schemas.openxmlformats.org/drawingml/2006/main" noChangeAspect="1"/>
+              <a:graphicFrameLocks noChangeAspect="1"/>
             </wp:cNvGraphicFramePr>
-            <a:graphic xmlns:a="http://schemas.openxmlformats.org/drawingml/2006/main">
+            <a:graphic>
               <a:graphicData uri="http://schemas.openxmlformats.org/drawingml/2006/picture">
-                <pic:pic xmlns:pic="http://schemas.openxmlformats.org/drawingml/2006/picture">
+                <pic:pic>
                   <pic:nvPicPr>
-                    <pic:cNvPr id="0" name="" descr=""/>
-                    <pic:cNvPicPr>
-                      <a:picLocks noChangeAspect="1" noChangeArrowheads="1"/>
-                    </pic:cNvPicPr>
+                    <pic:cNvPr id="0" name="G12_distribuciones.png"/>
+                    <pic:cNvPicPr/>
                   </pic:nvPicPr>
                   <pic:blipFill>
-                    <a:blip r:embed="rId20" cstate="none"/>
-                    <a:srcRect/>
+                    <a:blip r:embed="rId33"/>
                     <a:stretch>
                       <a:fillRect/>
                     </a:stretch>
                   </pic:blipFill>
-                  <pic:spPr bwMode="auto">
+                  <pic:spPr>
                     <a:xfrm>
                       <a:off x="0" y="0"/>
-                      <a:ext cx="5334000" cy="1943100"/>
+                      <a:ext cx="5334000" cy="1600200"/>
                     </a:xfrm>
-                    <a:prstGeom prst="rect">
-                      <a:avLst/>
-                    </a:prstGeom>
+                    <a:prstGeom prst="rect"/>
                   </pic:spPr>
                 </pic:pic>
               </a:graphicData>

</xml_diff>

<commit_message>
docs(entregable-2): define quality criteria and publish v3 presentation
- Add explicit OK / Menor / Critico criteria (impact on use) to the quality map
- Align the quality map across the deck, Parte A and Parte B
- Show test 2026 and precision on the capacity slide; absolute prevalence on before/after
- Explain the 2026 coverage tail and add transformations to the short deck
- Keep v1/v2 decks; new decks saved as v3; make chart script paths relative
</commit_message>
<xml_diff>
--- a/Entregable/Entregable 2/Entregable 2 - Parte A - COMPLETADO.docx
+++ b/Entregable/Entregable 2/Entregable 2 - Parte A - COMPLETADO.docx
@@ -5361,7 +5361,7 @@
         <w:tc>
           <w:tcPr>
             <w:tcW w:type="dxa" w:w="900"/>
-            <w:shd w:fill="FFEB9C" w:color="auto" w:val="clear"/>
+            <w:shd w:fill="FFC7CE" w:color="auto" w:val="clear"/>
             <w:tcMar>
               <w:top w:type="dxa" w:w="50"/>
               <w:left w:type="dxa" w:w="80"/>
@@ -5378,11 +5378,11 @@
               <w:rPr>
                 <w:b/>
                 <w:bCs/>
-                <w:color w:val="9C5700"/>
-                <w:sz w:val="15"/>
-                <w:szCs w:val="15"/>
-              </w:rPr>
-              <w:t xml:space="preserve">Amarillo</w:t>
+                <w:color w:val="9C0006"/>
+                <w:sz w:val="15"/>
+                <w:szCs w:val="15"/>
+              </w:rPr>
+              <w:t xml:space="preserve">Rojo</w:t>
             </w:r>
           </w:p>
         </w:tc>
@@ -5700,7 +5700,7 @@
         <w:tc>
           <w:tcPr>
             <w:tcW w:type="dxa" w:w="1000"/>
-            <w:shd w:fill="FFEB9C" w:color="auto" w:val="clear"/>
+            <w:shd w:fill="FFC7CE" w:color="auto" w:val="clear"/>
             <w:tcMar>
               <w:top w:type="dxa" w:w="50"/>
               <w:left w:type="dxa" w:w="80"/>
@@ -5717,11 +5717,11 @@
               <w:rPr>
                 <w:b/>
                 <w:bCs/>
-                <w:color w:val="9C5700"/>
-                <w:sz w:val="15"/>
-                <w:szCs w:val="15"/>
-              </w:rPr>
-              <w:t xml:space="preserve">Amarillo</w:t>
+                <w:color w:val="9C0006"/>
+                <w:sz w:val="15"/>
+                <w:szCs w:val="15"/>
+              </w:rPr>
+              <w:t xml:space="preserve">Rojo</w:t>
             </w:r>
           </w:p>
         </w:tc>
@@ -5801,7 +5801,7 @@
               <w:rPr>
                 <w:b/>
                 <w:bCs/>
-                <w:color w:val="006100"/>
+                <w:color w:val="9C0006"/>
                 <w:sz w:val="15"/>
                 <w:szCs w:val="15"/>
               </w:rPr>
@@ -5868,7 +5868,7 @@
         <w:tc>
           <w:tcPr>
             <w:tcW w:type="dxa" w:w="1000"/>
-            <w:shd w:fill="FFEB9C" w:color="auto" w:val="clear"/>
+            <w:shd w:fill="FFC7CE" w:color="auto" w:val="clear"/>
             <w:tcMar>
               <w:top w:type="dxa" w:w="50"/>
               <w:left w:type="dxa" w:w="80"/>
@@ -5885,11 +5885,11 @@
               <w:rPr>
                 <w:b/>
                 <w:bCs/>
-                <w:color w:val="9C5700"/>
-                <w:sz w:val="15"/>
-                <w:szCs w:val="15"/>
-              </w:rPr>
-              <w:t xml:space="preserve">Amarillo</w:t>
+                <w:color w:val="9C0006"/>
+                <w:sz w:val="15"/>
+                <w:szCs w:val="15"/>
+              </w:rPr>
+              <w:t xml:space="preserve">Rojo</w:t>
             </w:r>
           </w:p>
         </w:tc>
@@ -6252,7 +6252,7 @@
               <w:rPr>
                 <w:b/>
                 <w:bCs/>
-                <w:color w:val="006100"/>
+                <w:color w:val="9C0006"/>
                 <w:sz w:val="15"/>
                 <w:szCs w:val="15"/>
               </w:rPr>
@@ -6703,7 +6703,7 @@
               <w:rPr>
                 <w:b/>
                 <w:bCs/>
-                <w:color w:val="006100"/>
+                <w:color w:val="9C0006"/>
                 <w:sz w:val="15"/>
                 <w:szCs w:val="15"/>
               </w:rPr>
@@ -6996,7 +6996,7 @@
         <w:tc>
           <w:tcPr>
             <w:tcW w:type="dxa" w:w="1000"/>
-            <w:shd w:fill="C6EFCE" w:color="auto" w:val="clear"/>
+            <w:shd w:fill="FFC7CE" w:color="auto" w:val="clear"/>
             <w:tcMar>
               <w:top w:type="dxa" w:w="50"/>
               <w:left w:type="dxa" w:w="80"/>
@@ -7013,11 +7013,11 @@
               <w:rPr>
                 <w:b/>
                 <w:bCs/>
-                <w:color w:val="006100"/>
-                <w:sz w:val="15"/>
-                <w:szCs w:val="15"/>
-              </w:rPr>
-              <w:t xml:space="preserve">Verde</w:t>
+                <w:color w:val="9C0006"/>
+                <w:sz w:val="15"/>
+                <w:szCs w:val="15"/>
+              </w:rPr>
+              <w:t xml:space="preserve">Rojo</w:t>
             </w:r>
           </w:p>
         </w:tc>
@@ -7560,7 +7560,7 @@
         <w:tc>
           <w:tcPr>
             <w:tcW w:type="dxa" w:w="950"/>
-            <w:shd w:fill="FFC7CE" w:color="auto" w:val="clear"/>
+            <w:shd w:fill="FFEB9C" w:color="auto" w:val="clear"/>
             <w:tcMar>
               <w:top w:type="dxa" w:w="50"/>
               <w:left w:type="dxa" w:w="80"/>
@@ -7577,11 +7577,11 @@
               <w:rPr>
                 <w:b/>
                 <w:bCs/>
-                <w:color w:val="9C0006"/>
-                <w:sz w:val="15"/>
-                <w:szCs w:val="15"/>
-              </w:rPr>
-              <w:t xml:space="preserve">Rojo</w:t>
+                <w:color w:val="9C5700"/>
+                <w:sz w:val="15"/>
+                <w:szCs w:val="15"/>
+              </w:rPr>
+              <w:t xml:space="preserve">Amarillo</w:t>
             </w:r>
           </w:p>
         </w:tc>
@@ -7616,7 +7616,7 @@
         <w:tc>
           <w:tcPr>
             <w:tcW w:type="dxa" w:w="900"/>
-            <w:shd w:fill="FFC7CE" w:color="auto" w:val="clear"/>
+            <w:shd w:fill="FFEB9C" w:color="auto" w:val="clear"/>
             <w:tcMar>
               <w:top w:type="dxa" w:w="50"/>
               <w:left w:type="dxa" w:w="80"/>
@@ -7633,18 +7633,18 @@
               <w:rPr>
                 <w:b/>
                 <w:bCs/>
-                <w:color w:val="9C0006"/>
-                <w:sz w:val="15"/>
-                <w:szCs w:val="15"/>
-              </w:rPr>
-              <w:t xml:space="preserve">Rojo</w:t>
+                <w:color w:val="9C5700"/>
+                <w:sz w:val="15"/>
+                <w:szCs w:val="15"/>
+              </w:rPr>
+              <w:t xml:space="preserve">Amarillo</w:t>
             </w:r>
           </w:p>
         </w:tc>
         <w:tc>
           <w:tcPr>
             <w:tcW w:type="dxa" w:w="900"/>
-            <w:shd w:fill="FFC7CE" w:color="auto" w:val="clear"/>
+            <w:shd w:fill="FFEB9C" w:color="auto" w:val="clear"/>
             <w:tcMar>
               <w:top w:type="dxa" w:w="50"/>
               <w:left w:type="dxa" w:w="80"/>
@@ -7661,11 +7661,11 @@
               <w:rPr>
                 <w:b/>
                 <w:bCs/>
-                <w:color w:val="9C0006"/>
-                <w:sz w:val="15"/>
-                <w:szCs w:val="15"/>
-              </w:rPr>
-              <w:t xml:space="preserve">Rojo</w:t>
+                <w:color w:val="9C5700"/>
+                <w:sz w:val="15"/>
+                <w:szCs w:val="15"/>
+              </w:rPr>
+              <w:t xml:space="preserve">Amarillo</w:t>
             </w:r>
           </w:p>
         </w:tc>
@@ -8209,7 +8209,7 @@
         <w:tc>
           <w:tcPr>
             <w:tcW w:type="dxa" w:w="1050"/>
-            <w:shd w:fill="FFC7CE" w:color="auto" w:val="clear"/>
+            <w:shd w:fill="FFEB9C" w:color="auto" w:val="clear"/>
             <w:tcMar>
               <w:top w:type="dxa" w:w="50"/>
               <w:left w:type="dxa" w:w="80"/>
@@ -8226,11 +8226,11 @@
               <w:rPr>
                 <w:b/>
                 <w:bCs/>
-                <w:color w:val="9C0006"/>
-                <w:sz w:val="15"/>
-                <w:szCs w:val="15"/>
-              </w:rPr>
-              <w:t xml:space="preserve">Rojo</w:t>
+                <w:color w:val="9C5700"/>
+                <w:sz w:val="15"/>
+                <w:szCs w:val="15"/>
+              </w:rPr>
+              <w:t xml:space="preserve">Amarillo</w:t>
             </w:r>
           </w:p>
         </w:tc>
@@ -8729,8 +8729,9 @@
                 <w:sz w:val="16"/>
                 <w:szCs w:val="16"/>
               </w:rPr>
-              <w:t xml:space="preserve">Ventas — Unicidad
-Stock — Unicidad</w:t>
+              <w:t xml:space="preserve">Ventas — Unicidad</w:t>
+              <w:br/>
+              <w:t xml:space="preserve">Stock — Unicidad</w:t>
             </w:r>
           </w:p>
         </w:tc>
@@ -8844,7 +8845,7 @@
                 <w:sz w:val="16"/>
                 <w:szCs w:val="16"/>
               </w:rPr>
-              <w:t xml:space="preserve">Ventas — Exactitud</w:t>
+              <w:t xml:space="preserve">Ventas — Exactitud y Validez</w:t>
             </w:r>
           </w:p>
         </w:tc>
@@ -8871,7 +8872,7 @@
                 <w:sz w:val="16"/>
                 <w:szCs w:val="16"/>
               </w:rPr>
-              <w:t xml:space="preserve">2.317 filas con unidades y venta neta negativas de forma simultánea.</w:t>
+              <w:t xml:space="preserve">2.317 filas con unidades y venta neta negativas de forma simultánea. Son devoluciones reales registradas como venta (P23): netearlas en lugar de llevarlas a cero sube la prevalencia del target de 2,6% a 3,4%. Además, la venta está valuada al precio actual y no al histórico (H8).</w:t>
             </w:r>
           </w:p>
         </w:tc>
@@ -8929,7 +8930,7 @@
                 <w:sz w:val="16"/>
                 <w:szCs w:val="16"/>
               </w:rPr>
-              <w:t>1.020 filas registran venta mayor a cero con stock en cero el mismo mes (187 en 2026), y 5.727 registran venta superior al stock disponible (449 en 2026). Es el único problema de consistencia que persiste en el tramo 2026.</w:t>
+              <w:t xml:space="preserve">1.020 filas registran venta mayor a cero con stock en cero el mismo mes (187 en 2026), y 5.727 registran venta superior al stock disponible (449 en 2026). Además, el campo stock_en_tránsito no tiene definición y no se concilia con las transferencias: 8.771 unidades contra 936 a ago-2026 (a dic-2025, 23.528 contra 868). Queda fuera del modelo.</w:t>
             </w:r>
           </w:p>
         </w:tc>
@@ -9072,7 +9073,7 @@
                 <w:sz w:val="16"/>
                 <w:szCs w:val="16"/>
               </w:rPr>
-              <w:t xml:space="preserve">Tiendas — Consistencia y Exactitud</w:t>
+              <w:t xml:space="preserve">Productos_catalogo — Completitud</w:t>
             </w:r>
           </w:p>
         </w:tc>
@@ -9099,7 +9100,7 @@
                 <w:sz w:val="16"/>
                 <w:szCs w:val="16"/>
               </w:rPr>
-              <w:t xml:space="preserve">Las fechas de apertura de seis tiendas son posteriores a los primeros registros de venta de esas mismas tiendas.</w:t>
+              <w:t xml:space="preserve">22 SKUs sin costo unitario. Para valuar su stock se usa el costo de OC × 1,2321, un supuesto declarado (P3-P7): con él, el stock de esos SKUs a ago-2026 vale $72,3 M contra $58,7 M con la mediana de categoría.</w:t>
             </w:r>
           </w:p>
         </w:tc>
@@ -9129,7 +9130,7 @@
                 <w:sz w:val="16"/>
                 <w:szCs w:val="16"/>
               </w:rPr>
-              <w:t xml:space="preserve">Liquidaciones — Consistencia</w:t>
+              <w:t xml:space="preserve">Productos_catalogo e Historial_Precios — Trazabilidad</w:t>
             </w:r>
           </w:p>
         </w:tc>
@@ -9157,7 +9158,7 @@
                 <w:sz w:val="16"/>
                 <w:szCs w:val="16"/>
               </w:rPr>
-              <w:t>90 de las 108 liquidaciones con motivo «Discontinuación» corresponden a SKUs que figuran como Activos en el catálogo. 12 registros usan «Todas» como tienda, que no es un identificador válido.</w:t>
+              <w:t xml:space="preserve">El sistema pisa el precio vigente y no guarda historia: el historial se reconstruyó una sola vez para este proyecto (P8-P10) y el costo de catálogo no tiene una definición documentada. Por eso precio, costo y margen no entran al modelo en valor absoluto.</w:t>
             </w:r>
           </w:p>
         </w:tc>
@@ -9186,7 +9187,7 @@
                 <w:sz w:val="16"/>
                 <w:szCs w:val="16"/>
               </w:rPr>
-              <w:t xml:space="preserve">Historial_Precios — Consistencia</w:t>
+              <w:t xml:space="preserve">Tiendas — Consistencia y Exactitud</w:t>
             </w:r>
           </w:p>
         </w:tc>
@@ -9213,7 +9214,7 @@
                 <w:sz w:val="16"/>
                 <w:szCs w:val="16"/>
               </w:rPr>
-              <w:t>El precio implícito de las ventas supera en más de 1,5 veces al precio vigente según el historial en el 33% de las filas, llegando hasta 5,4 veces.</w:t>
+              <w:t xml:space="preserve">Las fechas de apertura de seis tiendas son posteriores a los primeros registros de venta de esas mismas tiendas.</w:t>
             </w:r>
           </w:p>
         </w:tc>
@@ -9243,7 +9244,7 @@
                 <w:sz w:val="16"/>
                 <w:szCs w:val="16"/>
               </w:rPr>
-              <w:t xml:space="preserve">Presupuesto — Consistencia</w:t>
+              <w:t xml:space="preserve">Liquidaciones — Consistencia</w:t>
             </w:r>
           </w:p>
         </w:tc>
@@ -9271,7 +9272,7 @@
                 <w:sz w:val="16"/>
                 <w:szCs w:val="16"/>
               </w:rPr>
-              <w:t xml:space="preserve">El cumplimiento se mantiene entre 90% y 92% en todos los niveles de apertura (año, categoría, tienda y celda individual), una uniformidad que no es esperable en un presupuesto fijado de forma independiente.</w:t>
+              <w:t>90 de las 108 liquidaciones con motivo «Discontinuación» corresponden a SKUs que figuran como Activos en el catálogo. 12 registros usan «Todas» como tienda, que no es un identificador válido.</w:t>
             </w:r>
           </w:p>
         </w:tc>
@@ -9300,7 +9301,7 @@
                 <w:sz w:val="16"/>
                 <w:szCs w:val="16"/>
               </w:rPr>
-              <w:t xml:space="preserve">Promociones — Exactitud, Validez y Unicidad</w:t>
+              <w:t xml:space="preserve">Historial_Precios — Consistencia</w:t>
             </w:r>
           </w:p>
         </w:tc>
@@ -9327,7 +9328,7 @@
                 <w:sz w:val="16"/>
                 <w:szCs w:val="16"/>
               </w:rPr>
-              <w:t xml:space="preserve">Descuentos de 150% y de −15%; dos promociones con fecha de fin anterior a la de inicio; dos identificadores repetidos, uno de ellos con valores de descuento distintos.</w:t>
+              <w:t>El precio implícito de las ventas supera en más de 1,5 veces al precio vigente según el historial en el 33% de las filas, llegando hasta 5,4 veces.</w:t>
             </w:r>
           </w:p>
         </w:tc>
@@ -9357,7 +9358,7 @@
                 <w:sz w:val="16"/>
                 <w:szCs w:val="16"/>
               </w:rPr>
-              <w:t xml:space="preserve">Transferencias — Consistencia</w:t>
+              <w:t xml:space="preserve">Presupuesto — Consistencia</w:t>
             </w:r>
           </w:p>
         </w:tc>
@@ -9385,7 +9386,7 @@
                 <w:sz w:val="16"/>
                 <w:szCs w:val="16"/>
               </w:rPr>
-              <w:t>Las transferencias no explican el volumen del campo stock_en_tránsito: 936 unidades contra 8.771 registradas en Stock a ago-2026 (a dic-2025, 868 contra 23.528).</w:t>
+              <w:t xml:space="preserve">El cumplimiento se mantiene entre 90% y 92% en todos los niveles de apertura (año, categoría, tienda y celda individual), una uniformidad que no es esperable en un presupuesto fijado de forma independiente.</w:t>
             </w:r>
           </w:p>
         </w:tc>
@@ -9394,7 +9395,6 @@
         <w:tc>
           <w:tcPr>
             <w:tcW w:type="dxa" w:w="2400"/>
-            <w:shd w:fill="F2F2F2" w:color="auto" w:val="clear"/>
             <w:tcMar>
               <w:top w:type="dxa" w:w="50"/>
               <w:left w:type="dxa" w:w="80"/>
@@ -9422,7 +9422,6 @@
         <w:tc>
           <w:tcPr>
             <w:tcW w:type="dxa" w:w="6600"/>
-            <w:shd w:fill="F2F2F2" w:color="auto" w:val="clear"/>
             <w:tcMar>
               <w:top w:type="dxa" w:w="50"/>
               <w:left w:type="dxa" w:w="80"/>
@@ -9461,6 +9460,87 @@
           <w:szCs w:val="21"/>
         </w:rPr>
         <w:t xml:space="preserve">Criterios aplicados</w:t>
+      </w:r>
+    </w:p>
+    <w:p>
+      <w:pPr>
+        <w:pStyle w:val="ListParagraph"/>
+        <w:numPr>
+          <w:ilvl w:val="0"/>
+          <w:numId w:val="2"/>
+        </w:numPr>
+        <w:spacing w:after="60" w:line="264"/>
+        <w:jc w:val="both"/>
+      </w:pPr>
+      <w:r>
+        <w:rPr>
+          <w:b/>
+          <w:bCs/>
+          <w:sz w:val="21"/>
+          <w:szCs w:val="21"/>
+        </w:rPr>
+        <w:t xml:space="preserve">Verde (sin problemas): </w:t>
+      </w:r>
+      <w:r>
+        <w:rPr>
+          <w:sz w:val="21"/>
+          <w:szCs w:val="21"/>
+        </w:rPr>
+        <w:t xml:space="preserve">no se detectó ningún problema. Los nulos esperables no cuentan.</w:t>
+      </w:r>
+    </w:p>
+    <w:p>
+      <w:pPr>
+        <w:pStyle w:val="ListParagraph"/>
+        <w:numPr>
+          <w:ilvl w:val="0"/>
+          <w:numId w:val="2"/>
+        </w:numPr>
+        <w:spacing w:after="60" w:line="264"/>
+        <w:jc w:val="both"/>
+      </w:pPr>
+      <w:r>
+        <w:rPr>
+          <w:b/>
+          <w:bCs/>
+          <w:sz w:val="21"/>
+          <w:szCs w:val="21"/>
+        </w:rPr>
+        <w:t xml:space="preserve">Amarillo (issue menor): </w:t>
+      </w:r>
+      <w:r>
+        <w:rPr>
+          <w:sz w:val="21"/>
+          <w:szCs w:val="21"/>
+        </w:rPr>
+        <w:t xml:space="preserve">el problema existe pero no cambia ningún resultado: afecta pocos registros que se excluyen, un campo que no se usa, o se corrige con una regla mecánica sin supuestos.</w:t>
+      </w:r>
+    </w:p>
+    <w:p>
+      <w:pPr>
+        <w:pStyle w:val="ListParagraph"/>
+        <w:numPr>
+          <w:ilvl w:val="0"/>
+          <w:numId w:val="2"/>
+        </w:numPr>
+        <w:spacing w:after="60" w:line="264"/>
+        <w:jc w:val="both"/>
+      </w:pPr>
+      <w:r>
+        <w:rPr>
+          <w:b/>
+          <w:bCs/>
+          <w:sz w:val="21"/>
+          <w:szCs w:val="21"/>
+        </w:rPr>
+        <w:t xml:space="preserve">Rojo (issue crítico): </w:t>
+      </w:r>
+      <w:r>
+        <w:rPr>
+          <w:sz w:val="21"/>
+          <w:szCs w:val="21"/>
+        </w:rPr>
+        <w:t xml:space="preserve">si no se trata, cambia un KPI, el target o una variable del modelo, o para usar el dato hace falta un supuesto o la confirmación del negocio. El criterio es el impacto en el uso, no la cantidad de errores.</w:t>
       </w:r>
     </w:p>
     <w:p>

</xml_diff>